<commit_message>
Elimina grafica 3D, agrega presentacion PowerPoint
- Elimina graph_3d.py y todas sus referencias de main_window.py
- Elimina matplotlib y numpy de requirements.txt
- Agrega Exposicion_GaussJordan.pptx con 11 diapositivas
- Agrega crear_presentacion.js para regenerar la presentacion

Co-Authored-By: Claude Sonnet 4.6 <noreply@anthropic.com>
</commit_message>
<xml_diff>
--- a/Informe_GJ_v2.docx
+++ b/Informe_GJ_v2.docx
@@ -153,46 +153,14 @@
     </w:p>
     <w:p>
       <w:pPr>
-        <w:spacing w:before="480" w:after="120"/>
-        <w:jc w:val="center"/>
-      </w:pPr>
-      <w:r>
-        <w:rPr>
-          <w:b/>
-          <w:bCs/>
-        </w:rPr>
-        <w:t>Docente:</w:t>
-      </w:r>
-    </w:p>
-    <w:p>
-      <w:pPr>
-        <w:spacing w:after="240"/>
-        <w:jc w:val="center"/>
-      </w:pPr>
-      <w:r>
-        <w:t>Ing. Nombre del Profesor</w:t>
-      </w:r>
-    </w:p>
-    <w:p>
-      <w:pPr>
-        <w:spacing w:after="120"/>
-        <w:jc w:val="center"/>
-      </w:pPr>
-      <w:r>
-        <w:rPr>
-          <w:b/>
-          <w:bCs/>
-        </w:rPr>
-        <w:t>Estudiante(s):</w:t>
-      </w:r>
-    </w:p>
-    <w:p>
-      <w:pPr>
         <w:spacing w:after="80"/>
         <w:jc w:val="center"/>
-      </w:pPr>
-      <w:r>
-        <w:t>Nombre del Estudiante</w:t>
+        <w:rPr>
+          <w:u w:val="single"/>
+        </w:rPr>
+      </w:pPr>
+      <w:r>
+        <w:t>Diego Robles 191980</w:t>
       </w:r>
     </w:p>
     <w:p>
@@ -241,10 +209,7 @@
         <w:t>gráfica</w:t>
       </w:r>
       <w:r>
-        <w:t xml:space="preserve"> que </w:t>
-      </w:r>
-      <w:r>
-        <w:t xml:space="preserve">resuelva sistemas de ecuaciones lineales de 3x3 usando el </w:t>
+        <w:t xml:space="preserve"> que resuelva sistemas de ecuaciones lineales de 3x3 usando el </w:t>
       </w:r>
       <w:r>
         <w:t>método</w:t>
@@ -318,10 +283,7 @@
         <w:t>gráfica</w:t>
       </w:r>
       <w:r>
-        <w:t xml:space="preserve"> con PySide6 donde el usuario pueda escribir las ecuaciones o los coeficientes directamente en la matriz</w:t>
-      </w:r>
-      <w:r>
-        <w:t>.</w:t>
+        <w:t xml:space="preserve"> con PySide6 donde el usuario pueda escribir las ecuaciones o los coeficientes directamente en la matriz.</w:t>
       </w:r>
     </w:p>
     <w:p>
@@ -384,10 +346,7 @@
         <w:spacing w:after="80"/>
       </w:pPr>
       <w:r>
-        <w:t>Detectar cuando el sistema no tie</w:t>
-      </w:r>
-      <w:r>
-        <w:t xml:space="preserve">ne </w:t>
+        <w:t xml:space="preserve">Detectar cuando el sistema no tiene </w:t>
       </w:r>
       <w:r>
         <w:t>solución</w:t>
@@ -440,10 +399,7 @@
         <w:t>matemáticos</w:t>
       </w:r>
       <w:r>
-        <w:t xml:space="preserve"> de forma computacional. Uno de esos temas son los si</w:t>
-      </w:r>
-      <w:r>
-        <w:t xml:space="preserve">stemas de ecuaciones lineales, que aparecen en muchas </w:t>
+        <w:t xml:space="preserve"> de forma computacional. Uno de esos temas son los sistemas de ecuaciones lineales, que aparecen en muchas </w:t>
       </w:r>
       <w:r>
         <w:t>áreas</w:t>
@@ -488,10 +444,7 @@
         <w:t>teoría</w:t>
       </w:r>
       <w:r>
-        <w:t xml:space="preserve">. Por </w:t>
-      </w:r>
-      <w:r>
-        <w:t xml:space="preserve">eso se </w:t>
+        <w:t xml:space="preserve">. Por eso se </w:t>
       </w:r>
       <w:r>
         <w:t>decidió</w:t>
@@ -521,10 +474,7 @@
         <w:t>fácilmente</w:t>
       </w:r>
       <w:r>
-        <w:t>. Con est</w:t>
-      </w:r>
-      <w:r>
-        <w:t xml:space="preserve">e programa el </w:t>
+        <w:t xml:space="preserve">. Con este programa el </w:t>
       </w:r>
       <w:r>
         <w:t>cálculo</w:t>
@@ -664,10 +614,7 @@
         <w:t>representación</w:t>
       </w:r>
       <w:r>
-        <w:t xml:space="preserve"> matricial de este sistema es la matr</w:t>
-      </w:r>
-      <w:r>
-        <w:t>iz aumentada [</w:t>
+        <w:t xml:space="preserve"> matricial de este sistema es la matriz aumentada [</w:t>
       </w:r>
       <w:r>
         <w:t>Hab</w:t>
@@ -730,10 +677,7 @@
         <w:t>eliminación</w:t>
       </w:r>
       <w:r>
-        <w:t xml:space="preserve"> gaussiana. Su objetivo es transformar la matriz aumentada del sistema en la forma escalonada reducida por filas (RREF), aplicando operacione</w:t>
-      </w:r>
-      <w:r>
-        <w:t>s elementales de fila:</w:t>
+        <w:t xml:space="preserve"> gaussiana. Su objetivo es transformar la matriz aumentada del sistema en la forma escalonada reducida por filas (RREF), aplicando operaciones elementales de fila:</w:t>
       </w:r>
     </w:p>
     <w:p>
@@ -841,19 +785,13 @@
         <w:t>numérica</w:t>
       </w:r>
       <w:r>
-        <w:t xml:space="preserve"> del alg</w:t>
-      </w:r>
-      <w:r>
-        <w:t xml:space="preserve">oritmo, se utiliza pivoteo parcial: en cada paso se selecciona como pivote el elemento de mayor valor absoluto en la columna actual (desde la fila del pivote hasta la </w:t>
+        <w:t xml:space="preserve"> del algoritmo, se utiliza pivoteo parcial: en cada paso se selecciona como pivote el elemento de mayor valor absoluto en la columna actual (desde la fila del pivote hasta la </w:t>
       </w:r>
       <w:r>
         <w:t>última</w:t>
       </w:r>
       <w:r>
-        <w:t xml:space="preserve"> fila), intercambiando filas si es necesario. Esto reduce los errores de redondeo e</w:t>
-      </w:r>
-      <w:r>
-        <w:t>n implementaciones con punto flotante.</w:t>
+        <w:t xml:space="preserve"> fila), intercambiando filas si es necesario. Esto reduce los errores de redondeo en implementaciones con punto flotante.</w:t>
       </w:r>
     </w:p>
     <w:p>
@@ -891,12 +829,6 @@
         <w:gridCol w:w="3120"/>
       </w:tblGrid>
       <w:tr>
-        <w:tblPrEx>
-          <w:tblCellMar>
-            <w:top w:w="0" w:type="dxa"/>
-            <w:bottom w:w="0" w:type="dxa"/>
-          </w:tblCellMar>
-        </w:tblPrEx>
         <w:tc>
           <w:tcPr>
             <w:tcW w:w="3120" w:type="dxa"/>
@@ -998,12 +930,6 @@
         </w:tc>
       </w:tr>
       <w:tr>
-        <w:tblPrEx>
-          <w:tblCellMar>
-            <w:top w:w="0" w:type="dxa"/>
-            <w:bottom w:w="0" w:type="dxa"/>
-          </w:tblCellMar>
-        </w:tblPrEx>
         <w:tc>
           <w:tcPr>
             <w:tcW w:w="3120" w:type="dxa"/>
@@ -1115,12 +1041,6 @@
         </w:tc>
       </w:tr>
       <w:tr>
-        <w:tblPrEx>
-          <w:tblCellMar>
-            <w:top w:w="0" w:type="dxa"/>
-            <w:bottom w:w="0" w:type="dxa"/>
-          </w:tblCellMar>
-        </w:tblPrEx>
         <w:tc>
           <w:tcPr>
             <w:tcW w:w="3120" w:type="dxa"/>
@@ -1218,12 +1138,6 @@
         </w:tc>
       </w:tr>
       <w:tr>
-        <w:tblPrEx>
-          <w:tblCellMar>
-            <w:top w:w="0" w:type="dxa"/>
-            <w:bottom w:w="0" w:type="dxa"/>
-          </w:tblCellMar>
-        </w:tblPrEx>
         <w:tc>
           <w:tcPr>
             <w:tcW w:w="3120" w:type="dxa"/>
@@ -1475,12 +1389,6 @@
         <w:gridCol w:w="3510"/>
       </w:tblGrid>
       <w:tr>
-        <w:tblPrEx>
-          <w:tblCellMar>
-            <w:top w:w="0" w:type="dxa"/>
-            <w:bottom w:w="0" w:type="dxa"/>
-          </w:tblCellMar>
-        </w:tblPrEx>
         <w:tc>
           <w:tcPr>
             <w:tcW w:w="2340" w:type="dxa"/>
@@ -1582,12 +1490,6 @@
         </w:tc>
       </w:tr>
       <w:tr>
-        <w:tblPrEx>
-          <w:tblCellMar>
-            <w:top w:w="0" w:type="dxa"/>
-            <w:bottom w:w="0" w:type="dxa"/>
-          </w:tblCellMar>
-        </w:tblPrEx>
         <w:tc>
           <w:tcPr>
             <w:tcW w:w="2340" w:type="dxa"/>
@@ -1678,12 +1580,6 @@
         </w:tc>
       </w:tr>
       <w:tr>
-        <w:tblPrEx>
-          <w:tblCellMar>
-            <w:top w:w="0" w:type="dxa"/>
-            <w:bottom w:w="0" w:type="dxa"/>
-          </w:tblCellMar>
-        </w:tblPrEx>
         <w:tc>
           <w:tcPr>
             <w:tcW w:w="2340" w:type="dxa"/>
@@ -1795,12 +1691,6 @@
         </w:tc>
       </w:tr>
       <w:tr>
-        <w:tblPrEx>
-          <w:tblCellMar>
-            <w:top w:w="0" w:type="dxa"/>
-            <w:bottom w:w="0" w:type="dxa"/>
-          </w:tblCellMar>
-        </w:tblPrEx>
         <w:tc>
           <w:tcPr>
             <w:tcW w:w="2340" w:type="dxa"/>
@@ -1884,12 +1774,6 @@
         </w:tc>
       </w:tr>
       <w:tr>
-        <w:tblPrEx>
-          <w:tblCellMar>
-            <w:top w:w="0" w:type="dxa"/>
-            <w:bottom w:w="0" w:type="dxa"/>
-          </w:tblCellMar>
-        </w:tblPrEx>
         <w:tc>
           <w:tcPr>
             <w:tcW w:w="2340" w:type="dxa"/>
@@ -2107,10 +1991,7 @@
         <w:t>Visualización</w:t>
       </w:r>
       <w:r>
-        <w:t xml:space="preserve"> 3D: los tres planos del sistema y e</w:t>
-      </w:r>
-      <w:r>
-        <w:t xml:space="preserve">l punto de </w:t>
+        <w:t xml:space="preserve"> 3D: los tres planos del sistema y el punto de </w:t>
       </w:r>
       <w:r>
         <w:t>intersección</w:t>
@@ -2204,10 +2085,7 @@
         <w:t>definición</w:t>
       </w:r>
       <w:r>
-        <w:t xml:space="preserve"> de entradas (ecuaci</w:t>
-      </w:r>
-      <w:r>
-        <w:t>ones en texto libre y matriz directa), salidas (pasos, resultado y grafica 3D) y restricciones (</w:t>
+        <w:t xml:space="preserve"> de entradas (ecuaciones en texto libre y matriz directa), salidas (pasos, resultado y grafica 3D) y restricciones (</w:t>
       </w:r>
       <w:r>
         <w:t>precisión</w:t>
@@ -2253,10 +2131,7 @@
         <w:t>cálculo</w:t>
       </w:r>
       <w:r>
-        <w:t>, visualizador de pasos y grafica 3</w:t>
-      </w:r>
-      <w:r>
-        <w:t>D.</w:t>
+        <w:t>, visualizador de pasos y grafica 3D.</w:t>
       </w:r>
     </w:p>
     <w:p>
@@ -2402,12 +2277,6 @@
         <w:gridCol w:w="4330"/>
       </w:tblGrid>
       <w:tr>
-        <w:tblPrEx>
-          <w:tblCellMar>
-            <w:top w:w="0" w:type="dxa"/>
-            <w:bottom w:w="0" w:type="dxa"/>
-          </w:tblCellMar>
-        </w:tblPrEx>
         <w:tc>
           <w:tcPr>
             <w:tcW w:w="2340" w:type="dxa"/>
@@ -2509,12 +2378,6 @@
         </w:tc>
       </w:tr>
       <w:tr>
-        <w:tblPrEx>
-          <w:tblCellMar>
-            <w:top w:w="0" w:type="dxa"/>
-            <w:bottom w:w="0" w:type="dxa"/>
-          </w:tblCellMar>
-        </w:tblPrEx>
         <w:tc>
           <w:tcPr>
             <w:tcW w:w="2340" w:type="dxa"/>
@@ -2612,12 +2475,6 @@
         </w:tc>
       </w:tr>
       <w:tr>
-        <w:tblPrEx>
-          <w:tblCellMar>
-            <w:top w:w="0" w:type="dxa"/>
-            <w:bottom w:w="0" w:type="dxa"/>
-          </w:tblCellMar>
-        </w:tblPrEx>
         <w:tc>
           <w:tcPr>
             <w:tcW w:w="2340" w:type="dxa"/>
@@ -2708,12 +2565,6 @@
         </w:tc>
       </w:tr>
       <w:tr>
-        <w:tblPrEx>
-          <w:tblCellMar>
-            <w:top w:w="0" w:type="dxa"/>
-            <w:bottom w:w="0" w:type="dxa"/>
-          </w:tblCellMar>
-        </w:tblPrEx>
         <w:tc>
           <w:tcPr>
             <w:tcW w:w="2340" w:type="dxa"/>
@@ -2797,12 +2648,6 @@
         </w:tc>
       </w:tr>
       <w:tr>
-        <w:tblPrEx>
-          <w:tblCellMar>
-            <w:top w:w="0" w:type="dxa"/>
-            <w:bottom w:w="0" w:type="dxa"/>
-          </w:tblCellMar>
-        </w:tblPrEx>
         <w:tc>
           <w:tcPr>
             <w:tcW w:w="2340" w:type="dxa"/>
@@ -2914,12 +2759,6 @@
         </w:tc>
       </w:tr>
       <w:tr>
-        <w:tblPrEx>
-          <w:tblCellMar>
-            <w:top w:w="0" w:type="dxa"/>
-            <w:bottom w:w="0" w:type="dxa"/>
-          </w:tblCellMar>
-        </w:tblPrEx>
         <w:tc>
           <w:tcPr>
             <w:tcW w:w="2340" w:type="dxa"/>
@@ -3017,12 +2856,6 @@
         </w:tc>
       </w:tr>
       <w:tr>
-        <w:tblPrEx>
-          <w:tblCellMar>
-            <w:top w:w="0" w:type="dxa"/>
-            <w:bottom w:w="0" w:type="dxa"/>
-          </w:tblCellMar>
-        </w:tblPrEx>
         <w:tc>
           <w:tcPr>
             <w:tcW w:w="2340" w:type="dxa"/>
@@ -3148,10 +2981,7 @@
         <w:t>Jordán</w:t>
       </w:r>
       <w:r>
-        <w:t xml:space="preserve"> impl</w:t>
-      </w:r>
-      <w:r>
-        <w:t xml:space="preserve">ementado en el </w:t>
+        <w:t xml:space="preserve"> implementado en el </w:t>
       </w:r>
       <w:r>
         <w:t>módulo</w:t>
@@ -3403,16 +3233,7 @@
           <w:sz w:val="19"/>
           <w:szCs w:val="19"/>
         </w:rPr>
-        <w:t xml:space="preserve">  </w:t>
-      </w:r>
-      <w:r>
-        <w:rPr>
-          <w:rFonts w:ascii="Courier New" w:eastAsia="Courier New" w:hAnsi="Courier New" w:cs="Courier New"/>
-          <w:color w:val="1A1A6E"/>
-          <w:sz w:val="19"/>
-          <w:szCs w:val="19"/>
-        </w:rPr>
-        <w:t xml:space="preserve">       </w:t>
+        <w:t xml:space="preserve">         </w:t>
       </w:r>
       <w:r>
         <w:rPr>
@@ -3715,16 +3536,7 @@
           <w:sz w:val="19"/>
           <w:szCs w:val="19"/>
         </w:rPr>
-        <w:t xml:space="preserve">        </w:t>
-      </w:r>
-      <w:r>
-        <w:rPr>
-          <w:rFonts w:ascii="Courier New" w:eastAsia="Courier New" w:hAnsi="Courier New" w:cs="Courier New"/>
-          <w:color w:val="1A1A6E"/>
-          <w:sz w:val="19"/>
-          <w:szCs w:val="19"/>
-        </w:rPr>
-        <w:t xml:space="preserve"> +-------------v-------------+</w:t>
+        <w:t xml:space="preserve">         +-------------v-------------+</w:t>
       </w:r>
     </w:p>
     <w:p>
@@ -4048,16 +3860,7 @@
           <w:sz w:val="19"/>
           <w:szCs w:val="19"/>
         </w:rPr>
-        <w:t xml:space="preserve"> &lt; 2? --SI--&gt; volver   </w:t>
-      </w:r>
-      <w:r>
-        <w:rPr>
-          <w:rFonts w:ascii="Courier New" w:eastAsia="Courier New" w:hAnsi="Courier New" w:cs="Courier New"/>
-          <w:color w:val="1A1A6E"/>
-          <w:sz w:val="19"/>
-          <w:szCs w:val="19"/>
-        </w:rPr>
-        <w:t xml:space="preserve"> |</w:t>
+        <w:t xml:space="preserve"> &lt; 2? --SI--&gt; volver    |</w:t>
       </w:r>
     </w:p>
     <w:p>
@@ -4195,16 +3998,7 @@
           <w:sz w:val="19"/>
           <w:szCs w:val="19"/>
         </w:rPr>
-        <w:t xml:space="preserve">    Si</w:t>
-      </w:r>
-      <w:r>
-        <w:rPr>
-          <w:rFonts w:ascii="Courier New" w:eastAsia="Courier New" w:hAnsi="Courier New" w:cs="Courier New"/>
-          <w:color w:val="1A1A6E"/>
-          <w:sz w:val="19"/>
-          <w:szCs w:val="19"/>
-        </w:rPr>
-        <w:t xml:space="preserve">n </w:t>
+        <w:t xml:space="preserve">    Sin </w:t>
       </w:r>
       <w:r>
         <w:rPr>
@@ -4748,16 +4542,7 @@
           <w:sz w:val="19"/>
           <w:szCs w:val="19"/>
         </w:rPr>
-        <w:t xml:space="preserve">        SI factor != 0 ENTON</w:t>
-      </w:r>
-      <w:r>
-        <w:rPr>
-          <w:rFonts w:ascii="Courier New" w:eastAsia="Courier New" w:hAnsi="Courier New" w:cs="Courier New"/>
-          <w:color w:val="1A1A6E"/>
-          <w:sz w:val="19"/>
-          <w:szCs w:val="19"/>
-        </w:rPr>
-        <w:t>CES</w:t>
+        <w:t xml:space="preserve">        SI factor != 0 ENTONCES</w:t>
       </w:r>
     </w:p>
     <w:p>
@@ -5259,16 +5044,7 @@
           <w:sz w:val="19"/>
           <w:szCs w:val="19"/>
         </w:rPr>
-        <w:t xml:space="preserve">        self.matrix = copy.deepcop</w:t>
-      </w:r>
-      <w:r>
-        <w:rPr>
-          <w:rFonts w:ascii="Courier New" w:eastAsia="Courier New" w:hAnsi="Courier New" w:cs="Courier New"/>
-          <w:color w:val="1A1A6E"/>
-          <w:sz w:val="19"/>
-          <w:szCs w:val="19"/>
-        </w:rPr>
-        <w:t>y(matrix)</w:t>
+        <w:t xml:space="preserve">        self.matrix = copy.deepcopy(matrix)</w:t>
       </w:r>
     </w:p>
     <w:p>
@@ -5463,16 +5239,7 @@
           <w:sz w:val="19"/>
           <w:szCs w:val="19"/>
         </w:rPr>
-        <w:t xml:space="preserve">                continue      </w:t>
-      </w:r>
-      <w:r>
-        <w:rPr>
-          <w:rFonts w:ascii="Courier New" w:eastAsia="Courier New" w:hAnsi="Courier New" w:cs="Courier New"/>
-          <w:color w:val="1A1A6E"/>
-          <w:sz w:val="19"/>
-          <w:szCs w:val="19"/>
-        </w:rPr>
-        <w:t xml:space="preserve">                         # columna singular</w:t>
+        <w:t xml:space="preserve">                continue                               # columna singular</w:t>
       </w:r>
     </w:p>
     <w:p>
@@ -5547,16 +5314,7 @@
           <w:sz w:val="19"/>
           <w:szCs w:val="19"/>
         </w:rPr>
-        <w:t xml:space="preserve">  </w:t>
-      </w:r>
-      <w:r>
-        <w:rPr>
-          <w:rFonts w:ascii="Courier New" w:eastAsia="Courier New" w:hAnsi="Courier New" w:cs="Courier New"/>
-          <w:color w:val="1A1A6E"/>
-          <w:sz w:val="19"/>
-          <w:szCs w:val="19"/>
-        </w:rPr>
-        <w:t xml:space="preserve">          pivot = self.matrix[h][h]</w:t>
+        <w:t xml:space="preserve">            pivot = self.matrix[h][h]</w:t>
       </w:r>
     </w:p>
     <w:p>
@@ -5667,16 +5425,7 @@
           <w:sz w:val="19"/>
           <w:szCs w:val="19"/>
         </w:rPr>
-        <w:t xml:space="preserve">                if i</w:t>
-      </w:r>
-      <w:r>
-        <w:rPr>
-          <w:rFonts w:ascii="Courier New" w:eastAsia="Courier New" w:hAnsi="Courier New" w:cs="Courier New"/>
-          <w:color w:val="1A1A6E"/>
-          <w:sz w:val="19"/>
-          <w:szCs w:val="19"/>
-        </w:rPr>
-        <w:t xml:space="preserve"> != h:</w:t>
+        <w:t xml:space="preserve">                if i != h:</w:t>
       </w:r>
     </w:p>
     <w:p>
@@ -5769,16 +5518,7 @@
           <w:sz w:val="19"/>
           <w:szCs w:val="19"/>
         </w:rPr>
-        <w:t xml:space="preserve"> j in range(cols </w:t>
-      </w:r>
-      <w:r>
-        <w:rPr>
-          <w:rFonts w:ascii="Courier New" w:eastAsia="Courier New" w:hAnsi="Courier New" w:cs="Courier New"/>
-          <w:color w:val="1A1A6E"/>
-          <w:sz w:val="19"/>
-          <w:szCs w:val="19"/>
-        </w:rPr>
-        <w:t>+ 1)]</w:t>
+        <w:t xml:space="preserve"> j in range(cols + 1)]</w:t>
       </w:r>
     </w:p>
     <w:p>
@@ -6177,16 +5917,7 @@
           <w:sz w:val="19"/>
           <w:szCs w:val="19"/>
         </w:rPr>
-        <w:t xml:space="preserve">    wh</w:t>
-      </w:r>
-      <w:r>
-        <w:rPr>
-          <w:rFonts w:ascii="Courier New" w:eastAsia="Courier New" w:hAnsi="Courier New" w:cs="Courier New"/>
-          <w:color w:val="1A1A6E"/>
-          <w:sz w:val="19"/>
-          <w:szCs w:val="19"/>
-        </w:rPr>
-        <w:t>ile pos &lt; len(left):</w:t>
+        <w:t xml:space="preserve">    while pos &lt; len(left):</w:t>
       </w:r>
     </w:p>
     <w:p>
@@ -6393,12 +6124,6 @@
         <w:gridCol w:w="3420"/>
       </w:tblGrid>
       <w:tr>
-        <w:tblPrEx>
-          <w:tblCellMar>
-            <w:top w:w="0" w:type="dxa"/>
-            <w:bottom w:w="0" w:type="dxa"/>
-          </w:tblCellMar>
-        </w:tblPrEx>
         <w:tc>
           <w:tcPr>
             <w:tcW w:w="3240" w:type="dxa"/>
@@ -6500,12 +6225,6 @@
         </w:tc>
       </w:tr>
       <w:tr>
-        <w:tblPrEx>
-          <w:tblCellMar>
-            <w:top w:w="0" w:type="dxa"/>
-            <w:bottom w:w="0" w:type="dxa"/>
-          </w:tblCellMar>
-        </w:tblPrEx>
         <w:tc>
           <w:tcPr>
             <w:tcW w:w="3240" w:type="dxa"/>
@@ -6603,12 +6322,6 @@
         </w:tc>
       </w:tr>
       <w:tr>
-        <w:tblPrEx>
-          <w:tblCellMar>
-            <w:top w:w="0" w:type="dxa"/>
-            <w:bottom w:w="0" w:type="dxa"/>
-          </w:tblCellMar>
-        </w:tblPrEx>
         <w:tc>
           <w:tcPr>
             <w:tcW w:w="3240" w:type="dxa"/>
@@ -6706,12 +6419,6 @@
         </w:tc>
       </w:tr>
       <w:tr>
-        <w:tblPrEx>
-          <w:tblCellMar>
-            <w:top w:w="0" w:type="dxa"/>
-            <w:bottom w:w="0" w:type="dxa"/>
-          </w:tblCellMar>
-        </w:tblPrEx>
         <w:tc>
           <w:tcPr>
             <w:tcW w:w="3240" w:type="dxa"/>
@@ -6802,12 +6509,6 @@
         </w:tc>
       </w:tr>
       <w:tr>
-        <w:tblPrEx>
-          <w:tblCellMar>
-            <w:top w:w="0" w:type="dxa"/>
-            <w:bottom w:w="0" w:type="dxa"/>
-          </w:tblCellMar>
-        </w:tblPrEx>
         <w:tc>
           <w:tcPr>
             <w:tcW w:w="3240" w:type="dxa"/>
@@ -6891,12 +6592,6 @@
         </w:tc>
       </w:tr>
       <w:tr>
-        <w:tblPrEx>
-          <w:tblCellMar>
-            <w:top w:w="0" w:type="dxa"/>
-            <w:bottom w:w="0" w:type="dxa"/>
-          </w:tblCellMar>
-        </w:tblPrEx>
         <w:tc>
           <w:tcPr>
             <w:tcW w:w="3240" w:type="dxa"/>
@@ -7162,10 +6857,7 @@
         <w:t>Jordán</w:t>
       </w:r>
       <w:r>
-        <w:t xml:space="preserve"> por dentro. No es lo mismo leerlo en</w:t>
-      </w:r>
-      <w:r>
-        <w:t xml:space="preserve"> un libro que tener que programarlo, porque hay que pensar en cada caso posible como el pivote cero o las filas dependientes.</w:t>
+        <w:t xml:space="preserve"> por dentro. No es lo mismo leerlo en un libro que tener que programarlo, porque hay que pensar en cada caso posible como el pivote cero o las filas dependientes.</w:t>
       </w:r>
     </w:p>
     <w:p>
@@ -7184,10 +6876,7 @@
         <w:t>decisión</w:t>
       </w:r>
       <w:r>
-        <w:t xml:space="preserve"> importante. Con decimales hay errores de redondeo que hacen que el re</w:t>
-      </w:r>
-      <w:r>
-        <w:t>sultado no sea correcto, y con fracciones el programa siempre da el valor exacto.</w:t>
+        <w:t xml:space="preserve"> importante. Con decimales hay errores de redondeo que hacen que el resultado no sea correcto, y con fracciones el programa siempre da el valor exacto.</w:t>
       </w:r>
     </w:p>
     <w:p>
@@ -7230,10 +6919,7 @@
         <w:t>operación</w:t>
       </w:r>
       <w:r>
-        <w:t xml:space="preserve"> </w:t>
-      </w:r>
-      <w:r>
-        <w:t xml:space="preserve">se </w:t>
+        <w:t xml:space="preserve"> se </w:t>
       </w:r>
       <w:r>
         <w:t>aplicó</w:t>
@@ -7283,10 +6969,7 @@
         <w:t>par ser</w:t>
       </w:r>
       <w:r>
-        <w:t xml:space="preserve"> de ecuaciones quedo b</w:t>
-      </w:r>
-      <w:r>
-        <w:t>astante flexible. Acepta formatos como (1/</w:t>
+        <w:t xml:space="preserve"> de ecuaciones quedo bastante flexible. Acepta formatos como (1/</w:t>
       </w:r>
       <w:r>
         <w:t>2) x</w:t>
@@ -7317,10 +7000,7 @@
         <w:t>método</w:t>
       </w:r>
       <w:r>
-        <w:t xml:space="preserve"> hasta tenerlo corriendo sin errores, lo que </w:t>
-      </w:r>
-      <w:r>
-        <w:t xml:space="preserve">fue muy </w:t>
+        <w:t xml:space="preserve"> hasta tenerlo corriendo sin errores, lo que fue muy </w:t>
       </w:r>
       <w:r>
         <w:t>útil</w:t>
@@ -7424,10 +7104,7 @@
         <w:t>Análisis</w:t>
       </w:r>
       <w:r>
-        <w:t xml:space="preserve"> (9th</w:t>
-      </w:r>
-      <w:r>
-        <w:t xml:space="preserve"> ed.). Brooks/Cole Cengage </w:t>
+        <w:t xml:space="preserve"> (9th ed.). Brooks/Cole Cengage </w:t>
       </w:r>
       <w:r>
         <w:t>Lear Ning</w:t>
@@ -7493,10 +7170,7 @@
         <w:t>Documentación</w:t>
       </w:r>
       <w:r>
-        <w:t>. https://docs.python.org/3/libra</w:t>
-      </w:r>
-      <w:r>
-        <w:t>ry/fractions.html</w:t>
+        <w:t>. https://docs.python.org/3/library/fractions.html</w:t>
       </w:r>
     </w:p>
     <w:p>

</xml_diff>